<commit_message>
Add completed QuickSort and Comparison algorithms.
</commit_message>
<xml_diff>
--- a/docs/algoritmos_ordenacao.docx
+++ b/docs/algoritmos_ordenacao.docx
@@ -124,7 +124,29 @@
           <w:szCs w:val="24"/>
           <w:lang w:val="pt-BR"/>
         </w:rPr>
-        <w:t>Audrey Regison dos Santos Cardoso</w:t>
+        <w:t xml:space="preserve">Audrey </w:t>
+      </w:r>
+      <w:proofErr w:type="spellStart"/>
+      <w:r>
+        <w:rPr>
+          <w:rFonts w:ascii="Carlito" w:eastAsia="Carlito" w:hAnsi="Carlito" w:cs="Carlito"/>
+          <w:color w:val="000000"/>
+          <w:sz w:val="24"/>
+          <w:szCs w:val="24"/>
+          <w:lang w:val="pt-BR"/>
+        </w:rPr>
+        <w:t>Regison</w:t>
+      </w:r>
+      <w:proofErr w:type="spellEnd"/>
+      <w:r>
+        <w:rPr>
+          <w:rFonts w:ascii="Carlito" w:eastAsia="Carlito" w:hAnsi="Carlito" w:cs="Carlito"/>
+          <w:color w:val="000000"/>
+          <w:sz w:val="24"/>
+          <w:szCs w:val="24"/>
+          <w:lang w:val="pt-BR"/>
+        </w:rPr>
+        <w:t xml:space="preserve"> dos Santos Cardoso</w:t>
       </w:r>
     </w:p>
     <w:p>
@@ -308,7 +330,29 @@
           <w:szCs w:val="24"/>
           <w:lang w:val="pt-BR"/>
         </w:rPr>
-        <w:t xml:space="preserve"> Implemente o algoritmo de ordenação QuickSort com o pivô sendo o elemento do meio. Em seguida, trabalhe os itens abaixo:</w:t>
+        <w:t xml:space="preserve"> Implemente o algoritmo de ordenação </w:t>
+      </w:r>
+      <w:proofErr w:type="spellStart"/>
+      <w:r>
+        <w:rPr>
+          <w:rFonts w:ascii="Carlito" w:eastAsia="Carlito" w:hAnsi="Carlito" w:cs="Carlito"/>
+          <w:color w:val="000000"/>
+          <w:sz w:val="24"/>
+          <w:szCs w:val="24"/>
+          <w:lang w:val="pt-BR"/>
+        </w:rPr>
+        <w:t>QuickSort</w:t>
+      </w:r>
+      <w:proofErr w:type="spellEnd"/>
+      <w:r>
+        <w:rPr>
+          <w:rFonts w:ascii="Carlito" w:eastAsia="Carlito" w:hAnsi="Carlito" w:cs="Carlito"/>
+          <w:color w:val="000000"/>
+          <w:sz w:val="24"/>
+          <w:szCs w:val="24"/>
+          <w:lang w:val="pt-BR"/>
+        </w:rPr>
+        <w:t xml:space="preserve"> com o pivô sendo o elemento do meio. Em seguida, trabalhe os itens abaixo:</w:t>
       </w:r>
     </w:p>
     <w:p>
@@ -469,7 +513,29 @@
           <w:szCs w:val="24"/>
           <w:lang w:val="pt-BR"/>
         </w:rPr>
-        <w:t xml:space="preserve"> Compare o tempo de execução do algoritmo quando o mesmo recebe como entrada sequências ordenadas (de forma crescente e decrescente) e desordenadas. Caso mais números fossem inseridos nas sequências, como o desempenho do algoritmo seria afetado? Usando dados reais, ilustre graficamente suas conclusões.</w:t>
+        <w:t xml:space="preserve"> Compare o tempo de execução do algoritmo quando </w:t>
+      </w:r>
+      <w:proofErr w:type="gramStart"/>
+      <w:r>
+        <w:rPr>
+          <w:rFonts w:ascii="Carlito" w:eastAsia="Carlito" w:hAnsi="Carlito" w:cs="Carlito"/>
+          <w:color w:val="000000"/>
+          <w:sz w:val="24"/>
+          <w:szCs w:val="24"/>
+          <w:lang w:val="pt-BR"/>
+        </w:rPr>
+        <w:t>o mesmo</w:t>
+      </w:r>
+      <w:proofErr w:type="gramEnd"/>
+      <w:r>
+        <w:rPr>
+          <w:rFonts w:ascii="Carlito" w:eastAsia="Carlito" w:hAnsi="Carlito" w:cs="Carlito"/>
+          <w:color w:val="000000"/>
+          <w:sz w:val="24"/>
+          <w:szCs w:val="24"/>
+          <w:lang w:val="pt-BR"/>
+        </w:rPr>
+        <w:t xml:space="preserve"> recebe como entrada sequências ordenadas (de forma crescente e decrescente) e desordenadas. Caso mais números fossem inseridos nas sequências, como o desempenho do algoritmo seria afetado? Usando dados reais, ilustre graficamente suas conclusões.</w:t>
       </w:r>
     </w:p>
     <w:p>
@@ -562,7 +628,29 @@
           <w:szCs w:val="24"/>
           <w:lang w:val="pt-BR"/>
         </w:rPr>
-        <w:t xml:space="preserve"> Implemente o algoritmo de ordenação HeapSort. Em seguida, trabalhe os itens abaixo:</w:t>
+        <w:t xml:space="preserve"> Implemente o algoritmo de ordenação </w:t>
+      </w:r>
+      <w:proofErr w:type="spellStart"/>
+      <w:r>
+        <w:rPr>
+          <w:rFonts w:ascii="Carlito" w:eastAsia="Carlito" w:hAnsi="Carlito" w:cs="Carlito"/>
+          <w:color w:val="000000"/>
+          <w:sz w:val="24"/>
+          <w:szCs w:val="24"/>
+          <w:lang w:val="pt-BR"/>
+        </w:rPr>
+        <w:t>HeapSort</w:t>
+      </w:r>
+      <w:proofErr w:type="spellEnd"/>
+      <w:r>
+        <w:rPr>
+          <w:rFonts w:ascii="Carlito" w:eastAsia="Carlito" w:hAnsi="Carlito" w:cs="Carlito"/>
+          <w:color w:val="000000"/>
+          <w:sz w:val="24"/>
+          <w:szCs w:val="24"/>
+          <w:lang w:val="pt-BR"/>
+        </w:rPr>
+        <w:t>. Em seguida, trabalhe os itens abaixo:</w:t>
       </w:r>
       <w:r>
         <w:rPr>
@@ -700,7 +788,29 @@
           <w:szCs w:val="24"/>
           <w:lang w:val="pt-BR"/>
         </w:rPr>
-        <w:t xml:space="preserve"> Compare o tempo de execução do algoritmo quando o mesmo recebe como entrada sequências ordenadas (em ordem crescente e decrescente) e desordenadas. Caso mais números fossem inseridos nas sequências, como o desempenho do algoritmo seria afetado? Usando dados reais, ilustre graficamente suas conclusões.</w:t>
+        <w:t xml:space="preserve"> Compare o tempo de execução do algoritmo quando </w:t>
+      </w:r>
+      <w:proofErr w:type="gramStart"/>
+      <w:r>
+        <w:rPr>
+          <w:rFonts w:ascii="Carlito" w:eastAsia="Carlito" w:hAnsi="Carlito" w:cs="Carlito"/>
+          <w:color w:val="000000"/>
+          <w:sz w:val="24"/>
+          <w:szCs w:val="24"/>
+          <w:lang w:val="pt-BR"/>
+        </w:rPr>
+        <w:t>o mesmo</w:t>
+      </w:r>
+      <w:proofErr w:type="gramEnd"/>
+      <w:r>
+        <w:rPr>
+          <w:rFonts w:ascii="Carlito" w:eastAsia="Carlito" w:hAnsi="Carlito" w:cs="Carlito"/>
+          <w:color w:val="000000"/>
+          <w:sz w:val="24"/>
+          <w:szCs w:val="24"/>
+          <w:lang w:val="pt-BR"/>
+        </w:rPr>
+        <w:t xml:space="preserve"> recebe como entrada sequências ordenadas (em ordem crescente e decrescente) e desordenadas. Caso mais números fossem inseridos nas sequências, como o desempenho do algoritmo seria afetado? Usando dados reais, ilustre graficamente suas conclusões.</w:t>
       </w:r>
     </w:p>
     <w:p>
@@ -748,7 +858,51 @@
           <w:szCs w:val="24"/>
           <w:lang w:val="pt-BR"/>
         </w:rPr>
-        <w:t xml:space="preserve"> Faça um estudo comparativo do algoritmo HeapSort implementado com os algoritmos QuickSort, usados na Questão 1, nas situações apresentadas.</w:t>
+        <w:t xml:space="preserve"> Faça um estudo comparativo do algoritmo </w:t>
+      </w:r>
+      <w:proofErr w:type="spellStart"/>
+      <w:r>
+        <w:rPr>
+          <w:rFonts w:ascii="Carlito" w:eastAsia="Carlito" w:hAnsi="Carlito" w:cs="Carlito"/>
+          <w:color w:val="000000"/>
+          <w:sz w:val="24"/>
+          <w:szCs w:val="24"/>
+          <w:lang w:val="pt-BR"/>
+        </w:rPr>
+        <w:t>HeapSort</w:t>
+      </w:r>
+      <w:proofErr w:type="spellEnd"/>
+      <w:r>
+        <w:rPr>
+          <w:rFonts w:ascii="Carlito" w:eastAsia="Carlito" w:hAnsi="Carlito" w:cs="Carlito"/>
+          <w:color w:val="000000"/>
+          <w:sz w:val="24"/>
+          <w:szCs w:val="24"/>
+          <w:lang w:val="pt-BR"/>
+        </w:rPr>
+        <w:t xml:space="preserve"> implementado com os algoritmos </w:t>
+      </w:r>
+      <w:proofErr w:type="spellStart"/>
+      <w:r>
+        <w:rPr>
+          <w:rFonts w:ascii="Carlito" w:eastAsia="Carlito" w:hAnsi="Carlito" w:cs="Carlito"/>
+          <w:color w:val="000000"/>
+          <w:sz w:val="24"/>
+          <w:szCs w:val="24"/>
+          <w:lang w:val="pt-BR"/>
+        </w:rPr>
+        <w:t>QuickSort</w:t>
+      </w:r>
+      <w:proofErr w:type="spellEnd"/>
+      <w:r>
+        <w:rPr>
+          <w:rFonts w:ascii="Carlito" w:eastAsia="Carlito" w:hAnsi="Carlito" w:cs="Carlito"/>
+          <w:color w:val="000000"/>
+          <w:sz w:val="24"/>
+          <w:szCs w:val="24"/>
+          <w:lang w:val="pt-BR"/>
+        </w:rPr>
+        <w:t>, usados na Questão 1, nas situações apresentadas.</w:t>
       </w:r>
     </w:p>
     <w:p>
@@ -794,7 +948,51 @@
           <w:szCs w:val="24"/>
           <w:lang w:val="pt-BR"/>
         </w:rPr>
-        <w:t xml:space="preserve"> Implemente os algoritmos de ordenação linear CountingSort e RadixSort. Em seguida, trabalhe os itens abaixo:</w:t>
+        <w:t xml:space="preserve"> Implemente os algoritmos de ordenação linear </w:t>
+      </w:r>
+      <w:proofErr w:type="spellStart"/>
+      <w:r>
+        <w:rPr>
+          <w:rFonts w:ascii="Carlito" w:eastAsia="Carlito" w:hAnsi="Carlito" w:cs="Carlito"/>
+          <w:color w:val="000000"/>
+          <w:sz w:val="24"/>
+          <w:szCs w:val="24"/>
+          <w:lang w:val="pt-BR"/>
+        </w:rPr>
+        <w:t>CountingSort</w:t>
+      </w:r>
+      <w:proofErr w:type="spellEnd"/>
+      <w:r>
+        <w:rPr>
+          <w:rFonts w:ascii="Carlito" w:eastAsia="Carlito" w:hAnsi="Carlito" w:cs="Carlito"/>
+          <w:color w:val="000000"/>
+          <w:sz w:val="24"/>
+          <w:szCs w:val="24"/>
+          <w:lang w:val="pt-BR"/>
+        </w:rPr>
+        <w:t xml:space="preserve"> e </w:t>
+      </w:r>
+      <w:proofErr w:type="spellStart"/>
+      <w:r>
+        <w:rPr>
+          <w:rFonts w:ascii="Carlito" w:eastAsia="Carlito" w:hAnsi="Carlito" w:cs="Carlito"/>
+          <w:color w:val="000000"/>
+          <w:sz w:val="24"/>
+          <w:szCs w:val="24"/>
+          <w:lang w:val="pt-BR"/>
+        </w:rPr>
+        <w:t>RadixSort</w:t>
+      </w:r>
+      <w:proofErr w:type="spellEnd"/>
+      <w:r>
+        <w:rPr>
+          <w:rFonts w:ascii="Carlito" w:eastAsia="Carlito" w:hAnsi="Carlito" w:cs="Carlito"/>
+          <w:color w:val="000000"/>
+          <w:sz w:val="24"/>
+          <w:szCs w:val="24"/>
+          <w:lang w:val="pt-BR"/>
+        </w:rPr>
+        <w:t>. Em seguida, trabalhe os itens abaixo:</w:t>
       </w:r>
     </w:p>
     <w:p>
@@ -842,7 +1040,29 @@
           <w:szCs w:val="24"/>
           <w:lang w:val="pt-BR"/>
         </w:rPr>
-        <w:t xml:space="preserve"> Analise o comportamento do tempo de execução do algoritmo CountingSort ao ordenar o conjunto de CEPs de exemplo em anexo. Durante a análise, comente a relação que existe entre o tamanho da sequência de entrada e o elemento de maior valor nessa sequência. Usando dados reais, ilustre graficamente suas conclusões.</w:t>
+        <w:t xml:space="preserve"> Analise o comportamento do tempo de execução do algoritmo </w:t>
+      </w:r>
+      <w:proofErr w:type="spellStart"/>
+      <w:r>
+        <w:rPr>
+          <w:rFonts w:ascii="Carlito" w:eastAsia="Carlito" w:hAnsi="Carlito" w:cs="Carlito"/>
+          <w:color w:val="000000"/>
+          <w:sz w:val="24"/>
+          <w:szCs w:val="24"/>
+          <w:lang w:val="pt-BR"/>
+        </w:rPr>
+        <w:t>CountingSort</w:t>
+      </w:r>
+      <w:proofErr w:type="spellEnd"/>
+      <w:r>
+        <w:rPr>
+          <w:rFonts w:ascii="Carlito" w:eastAsia="Carlito" w:hAnsi="Carlito" w:cs="Carlito"/>
+          <w:color w:val="000000"/>
+          <w:sz w:val="24"/>
+          <w:szCs w:val="24"/>
+          <w:lang w:val="pt-BR"/>
+        </w:rPr>
+        <w:t xml:space="preserve"> ao ordenar o conjunto de CEPs de exemplo em anexo. Durante a análise, comente a relação que existe entre o tamanho da sequência de entrada e o elemento de maior valor nessa sequência. Usando dados reais, ilustre graficamente suas conclusões.</w:t>
       </w:r>
       <w:r>
         <w:rPr>
@@ -887,7 +1107,73 @@
           <w:szCs w:val="24"/>
           <w:lang w:val="pt-BR"/>
         </w:rPr>
-        <w:t xml:space="preserve"> Analise o comportamento do tempo de execução do algoritmo RadixSort ao ordenar o conjunto de CEPs de exemplo em anexo. O RadixSort deverá ser implementado utilizando obrigatoriamente o algoritmo CountingSort como método de ordenação estável interno em cada etapa do processamento dos dígitos. Usando dados reais, ilustre graficamente suas conclusões.</w:t>
+        <w:t xml:space="preserve"> Analise o comportamento do tempo de execução do algoritmo </w:t>
+      </w:r>
+      <w:proofErr w:type="spellStart"/>
+      <w:r>
+        <w:rPr>
+          <w:rFonts w:ascii="Carlito" w:eastAsia="Carlito" w:hAnsi="Carlito" w:cs="Carlito"/>
+          <w:color w:val="000000"/>
+          <w:sz w:val="24"/>
+          <w:szCs w:val="24"/>
+          <w:lang w:val="pt-BR"/>
+        </w:rPr>
+        <w:t>RadixSort</w:t>
+      </w:r>
+      <w:proofErr w:type="spellEnd"/>
+      <w:r>
+        <w:rPr>
+          <w:rFonts w:ascii="Carlito" w:eastAsia="Carlito" w:hAnsi="Carlito" w:cs="Carlito"/>
+          <w:color w:val="000000"/>
+          <w:sz w:val="24"/>
+          <w:szCs w:val="24"/>
+          <w:lang w:val="pt-BR"/>
+        </w:rPr>
+        <w:t xml:space="preserve"> ao ordenar o conjunto de CEPs de exemplo em anexo. O </w:t>
+      </w:r>
+      <w:proofErr w:type="spellStart"/>
+      <w:r>
+        <w:rPr>
+          <w:rFonts w:ascii="Carlito" w:eastAsia="Carlito" w:hAnsi="Carlito" w:cs="Carlito"/>
+          <w:color w:val="000000"/>
+          <w:sz w:val="24"/>
+          <w:szCs w:val="24"/>
+          <w:lang w:val="pt-BR"/>
+        </w:rPr>
+        <w:t>RadixSort</w:t>
+      </w:r>
+      <w:proofErr w:type="spellEnd"/>
+      <w:r>
+        <w:rPr>
+          <w:rFonts w:ascii="Carlito" w:eastAsia="Carlito" w:hAnsi="Carlito" w:cs="Carlito"/>
+          <w:color w:val="000000"/>
+          <w:sz w:val="24"/>
+          <w:szCs w:val="24"/>
+          <w:lang w:val="pt-BR"/>
+        </w:rPr>
+        <w:t xml:space="preserve"> deverá ser implementado utilizando obrigatoriamente o algoritmo </w:t>
+      </w:r>
+      <w:proofErr w:type="spellStart"/>
+      <w:r>
+        <w:rPr>
+          <w:rFonts w:ascii="Carlito" w:eastAsia="Carlito" w:hAnsi="Carlito" w:cs="Carlito"/>
+          <w:color w:val="000000"/>
+          <w:sz w:val="24"/>
+          <w:szCs w:val="24"/>
+          <w:lang w:val="pt-BR"/>
+        </w:rPr>
+        <w:t>CountingSort</w:t>
+      </w:r>
+      <w:proofErr w:type="spellEnd"/>
+      <w:r>
+        <w:rPr>
+          <w:rFonts w:ascii="Carlito" w:eastAsia="Carlito" w:hAnsi="Carlito" w:cs="Carlito"/>
+          <w:color w:val="000000"/>
+          <w:sz w:val="24"/>
+          <w:szCs w:val="24"/>
+          <w:lang w:val="pt-BR"/>
+        </w:rPr>
+        <w:t xml:space="preserve"> como método de ordenação estável interno em cada etapa do processamento dos dígitos. Usando dados reais, ilustre graficamente suas conclusões.</w:t>
       </w:r>
       <w:r>
         <w:rPr>
@@ -932,7 +1218,205 @@
           <w:szCs w:val="24"/>
           <w:lang w:val="pt-BR"/>
         </w:rPr>
-        <w:t xml:space="preserve"> Faça um estudo comparativo do tempo de execução dos algoritmos CountingSort e RadixSort entre si e, em seguida, compare ambos com as implementações do QuickSort (Questão 1) e do HeapSort (Questão 2). Para isso, execute CountingSort, RadixSort, QuickSort e HeapSort utilizando como entrada o mesmo conjunto de CEPs de exemplo em anexo. Apresente os resultados obtidos e explique as diferenças observadas com base nas características e complexidades de cada algoritmo.</w:t>
+        <w:t xml:space="preserve"> Faça um estudo comparativo do tempo de execução dos algoritmos </w:t>
+      </w:r>
+      <w:proofErr w:type="spellStart"/>
+      <w:r>
+        <w:rPr>
+          <w:rFonts w:ascii="Carlito" w:eastAsia="Carlito" w:hAnsi="Carlito" w:cs="Carlito"/>
+          <w:color w:val="000000"/>
+          <w:sz w:val="24"/>
+          <w:szCs w:val="24"/>
+          <w:lang w:val="pt-BR"/>
+        </w:rPr>
+        <w:t>CountingSort</w:t>
+      </w:r>
+      <w:proofErr w:type="spellEnd"/>
+      <w:r>
+        <w:rPr>
+          <w:rFonts w:ascii="Carlito" w:eastAsia="Carlito" w:hAnsi="Carlito" w:cs="Carlito"/>
+          <w:color w:val="000000"/>
+          <w:sz w:val="24"/>
+          <w:szCs w:val="24"/>
+          <w:lang w:val="pt-BR"/>
+        </w:rPr>
+        <w:t xml:space="preserve"> e </w:t>
+      </w:r>
+      <w:proofErr w:type="spellStart"/>
+      <w:r>
+        <w:rPr>
+          <w:rFonts w:ascii="Carlito" w:eastAsia="Carlito" w:hAnsi="Carlito" w:cs="Carlito"/>
+          <w:color w:val="000000"/>
+          <w:sz w:val="24"/>
+          <w:szCs w:val="24"/>
+          <w:lang w:val="pt-BR"/>
+        </w:rPr>
+        <w:t>RadixSort</w:t>
+      </w:r>
+      <w:proofErr w:type="spellEnd"/>
+      <w:r>
+        <w:rPr>
+          <w:rFonts w:ascii="Carlito" w:eastAsia="Carlito" w:hAnsi="Carlito" w:cs="Carlito"/>
+          <w:color w:val="000000"/>
+          <w:sz w:val="24"/>
+          <w:szCs w:val="24"/>
+          <w:lang w:val="pt-BR"/>
+        </w:rPr>
+        <w:t xml:space="preserve"> entre si e, em seguida, compare ambos com as implementações do </w:t>
+      </w:r>
+      <w:proofErr w:type="spellStart"/>
+      <w:r>
+        <w:rPr>
+          <w:rFonts w:ascii="Carlito" w:eastAsia="Carlito" w:hAnsi="Carlito" w:cs="Carlito"/>
+          <w:color w:val="000000"/>
+          <w:sz w:val="24"/>
+          <w:szCs w:val="24"/>
+          <w:lang w:val="pt-BR"/>
+        </w:rPr>
+        <w:t>QuickSort</w:t>
+      </w:r>
+      <w:proofErr w:type="spellEnd"/>
+      <w:r>
+        <w:rPr>
+          <w:rFonts w:ascii="Carlito" w:eastAsia="Carlito" w:hAnsi="Carlito" w:cs="Carlito"/>
+          <w:color w:val="000000"/>
+          <w:sz w:val="24"/>
+          <w:szCs w:val="24"/>
+          <w:lang w:val="pt-BR"/>
+        </w:rPr>
+        <w:t xml:space="preserve"> (Questão 1) e do </w:t>
+      </w:r>
+      <w:proofErr w:type="spellStart"/>
+      <w:r>
+        <w:rPr>
+          <w:rFonts w:ascii="Carlito" w:eastAsia="Carlito" w:hAnsi="Carlito" w:cs="Carlito"/>
+          <w:color w:val="000000"/>
+          <w:sz w:val="24"/>
+          <w:szCs w:val="24"/>
+          <w:lang w:val="pt-BR"/>
+        </w:rPr>
+        <w:t>HeapSort</w:t>
+      </w:r>
+      <w:proofErr w:type="spellEnd"/>
+      <w:r>
+        <w:rPr>
+          <w:rFonts w:ascii="Carlito" w:eastAsia="Carlito" w:hAnsi="Carlito" w:cs="Carlito"/>
+          <w:color w:val="000000"/>
+          <w:sz w:val="24"/>
+          <w:szCs w:val="24"/>
+          <w:lang w:val="pt-BR"/>
+        </w:rPr>
+        <w:t xml:space="preserve"> (Questão 2). Para isso, execute </w:t>
+      </w:r>
+      <w:proofErr w:type="spellStart"/>
+      <w:r>
+        <w:rPr>
+          <w:rFonts w:ascii="Carlito" w:eastAsia="Carlito" w:hAnsi="Carlito" w:cs="Carlito"/>
+          <w:color w:val="000000"/>
+          <w:sz w:val="24"/>
+          <w:szCs w:val="24"/>
+          <w:lang w:val="pt-BR"/>
+        </w:rPr>
+        <w:t>CountingSort</w:t>
+      </w:r>
+      <w:proofErr w:type="spellEnd"/>
+      <w:r>
+        <w:rPr>
+          <w:rFonts w:ascii="Carlito" w:eastAsia="Carlito" w:hAnsi="Carlito" w:cs="Carlito"/>
+          <w:color w:val="000000"/>
+          <w:sz w:val="24"/>
+          <w:szCs w:val="24"/>
+          <w:lang w:val="pt-BR"/>
+        </w:rPr>
+        <w:t xml:space="preserve">, </w:t>
+      </w:r>
+      <w:proofErr w:type="spellStart"/>
+      <w:r>
+        <w:rPr>
+          <w:rFonts w:ascii="Carlito" w:eastAsia="Carlito" w:hAnsi="Carlito" w:cs="Carlito"/>
+          <w:color w:val="000000"/>
+          <w:sz w:val="24"/>
+          <w:szCs w:val="24"/>
+          <w:lang w:val="pt-BR"/>
+        </w:rPr>
+        <w:t>RadixSort</w:t>
+      </w:r>
+      <w:proofErr w:type="spellEnd"/>
+      <w:r>
+        <w:rPr>
+          <w:rFonts w:ascii="Carlito" w:eastAsia="Carlito" w:hAnsi="Carlito" w:cs="Carlito"/>
+          <w:color w:val="000000"/>
+          <w:sz w:val="24"/>
+          <w:szCs w:val="24"/>
+          <w:lang w:val="pt-BR"/>
+        </w:rPr>
+        <w:t xml:space="preserve">, </w:t>
+      </w:r>
+      <w:proofErr w:type="spellStart"/>
+      <w:r>
+        <w:rPr>
+          <w:rFonts w:ascii="Carlito" w:eastAsia="Carlito" w:hAnsi="Carlito" w:cs="Carlito"/>
+          <w:color w:val="000000"/>
+          <w:sz w:val="24"/>
+          <w:szCs w:val="24"/>
+          <w:lang w:val="pt-BR"/>
+        </w:rPr>
+        <w:t>QuickSort</w:t>
+      </w:r>
+      <w:proofErr w:type="spellEnd"/>
+      <w:r>
+        <w:rPr>
+          <w:rFonts w:ascii="Carlito" w:eastAsia="Carlito" w:hAnsi="Carlito" w:cs="Carlito"/>
+          <w:color w:val="000000"/>
+          <w:sz w:val="24"/>
+          <w:szCs w:val="24"/>
+          <w:lang w:val="pt-BR"/>
+        </w:rPr>
+        <w:t xml:space="preserve"> e </w:t>
+      </w:r>
+      <w:proofErr w:type="spellStart"/>
+      <w:r>
+        <w:rPr>
+          <w:rFonts w:ascii="Carlito" w:eastAsia="Carlito" w:hAnsi="Carlito" w:cs="Carlito"/>
+          <w:color w:val="000000"/>
+          <w:sz w:val="24"/>
+          <w:szCs w:val="24"/>
+          <w:lang w:val="pt-BR"/>
+        </w:rPr>
+        <w:t>HeapSort</w:t>
+      </w:r>
+      <w:proofErr w:type="spellEnd"/>
+      <w:r>
+        <w:rPr>
+          <w:rFonts w:ascii="Carlito" w:eastAsia="Carlito" w:hAnsi="Carlito" w:cs="Carlito"/>
+          <w:color w:val="000000"/>
+          <w:sz w:val="24"/>
+          <w:szCs w:val="24"/>
+          <w:lang w:val="pt-BR"/>
+        </w:rPr>
+        <w:t xml:space="preserve"> utilizando como entrada </w:t>
+      </w:r>
+      <w:proofErr w:type="gramStart"/>
+      <w:r>
+        <w:rPr>
+          <w:rFonts w:ascii="Carlito" w:eastAsia="Carlito" w:hAnsi="Carlito" w:cs="Carlito"/>
+          <w:color w:val="000000"/>
+          <w:sz w:val="24"/>
+          <w:szCs w:val="24"/>
+          <w:lang w:val="pt-BR"/>
+        </w:rPr>
+        <w:t>o mesmo conjunto</w:t>
+      </w:r>
+      <w:proofErr w:type="gramEnd"/>
+      <w:r>
+        <w:rPr>
+          <w:rFonts w:ascii="Carlito" w:eastAsia="Carlito" w:hAnsi="Carlito" w:cs="Carlito"/>
+          <w:color w:val="000000"/>
+          <w:sz w:val="24"/>
+          <w:szCs w:val="24"/>
+          <w:lang w:val="pt-BR"/>
+        </w:rPr>
+        <w:t xml:space="preserve"> de CEPs de exemplo em anexo. Apresente os resultados obtidos e explique as diferenças observadas com base nas características e complexidades de cada algoritmo.</w:t>
       </w:r>
       <w:r>
         <w:rPr>
@@ -1366,6 +1850,7 @@
           <w:color w:val="000000"/>
           <w:sz w:val="24"/>
           <w:szCs w:val="24"/>
+          <w:highlight w:val="yellow"/>
           <w:lang w:val="pt-BR"/>
         </w:rPr>
         <w:t>Além disso, nas situações em que houver comparação entre algoritmos, deverão ser apresentados gráficos comparativos contendo, para um mesmo tipo de entrada, as curvas correspondentes aos diferentes algoritmos implementados.</w:t>
@@ -3189,6 +3674,7 @@
   <w:style w:type="character" w:default="1" w:styleId="Fontepargpadro">
     <w:name w:val="Default Paragraph Font"/>
     <w:uiPriority w:val="1"/>
+    <w:semiHidden/>
     <w:unhideWhenUsed/>
   </w:style>
   <w:style w:type="table" w:default="1" w:styleId="Tabelanormal">

</xml_diff>